<commit_message>
docs: sync github issue evidence
</commit_message>
<xml_diff>
--- a/Report Test subject/report/Powered by GPT - Software Quality Verification - Final Report.docx
+++ b/Report Test subject/report/Powered by GPT - Software Quality Verification - Final Report.docx
@@ -544,13 +544,7 @@
           <w:rFonts w:ascii="Courier New" w:hAnsi="Courier New" w:cs="Courier New"/>
         </w:rPr>
         <w:lastRenderedPageBreak/>
-        <w:t>project also exposes a small API surface for service health and public catalog access. The test submission was built directly from source-code inspection, seeded demo data, local execution, and evidence collected from the running applic</w:t>
-      </w:r>
-      <w:r>
-        <w:rPr>
-          <w:rFonts w:ascii="Courier New" w:hAnsi="Courier New" w:cs="Courier New"/>
-        </w:rPr>
-        <w:t>ation.</w:t>
+        <w:t>project also exposes a small API surface for service health and public catalog access. The test submission was built directly from source-code inspection, seeded demo data, local execution, and evidence collected from the running application.</w:t>
       </w:r>
     </w:p>
     <w:p>
@@ -3608,77 +3602,249 @@
         <w:rPr>
           <w:rFonts w:ascii="Courier New" w:hAnsi="Courier New" w:cs="Courier New"/>
         </w:rPr>
-        <w:t>[INSERT FIGURE E-1: `evidence/ui/automation/20260406_053930_TC-UI-AUTH-001-success.png`]</w:t>
-      </w:r>
-    </w:p>
-    <w:p>
-      <w:pPr>
-        <w:pStyle w:val="PlainText"/>
-        <w:rPr>
-          <w:rFonts w:ascii="Courier New" w:hAnsi="Courier New" w:cs="Courier New"/>
-        </w:rPr>
-      </w:pPr>
-      <w:r>
-        <w:rPr>
-          <w:rFonts w:ascii="Courier New" w:hAnsi="Courier New" w:cs="Courier New"/>
-        </w:rPr>
-        <w:t>[INSERT FIGURE E-2: screenshot or text capture of `results/automation-api/newman-full-run.txt`]</w:t>
-      </w:r>
-    </w:p>
-    <w:p>
-      <w:pPr>
-        <w:pStyle w:val="PlainText"/>
-        <w:rPr>
-          <w:rFonts w:ascii="Courier New" w:hAnsi="Courier New" w:cs="Courier New"/>
-        </w:rPr>
-      </w:pPr>
-      <w:r>
-        <w:rPr>
-          <w:rFonts w:ascii="Courier New" w:hAnsi="Courier New" w:cs="Courier New"/>
-        </w:rPr>
-        <w:t>[INSERT FIGURE E-3: `evidence/ui/automation/20260406_054004_TC-UI-PUR-001-draft-created.png`]</w:t>
-      </w:r>
-    </w:p>
-    <w:p>
-      <w:pPr>
-        <w:pStyle w:val="PlainText"/>
-        <w:rPr>
-          <w:rFonts w:ascii="Courier New" w:hAnsi="Courier New" w:cs="Courier New"/>
-        </w:rPr>
-      </w:pPr>
-      <w:r>
-        <w:rPr>
-          <w:rFonts w:ascii="Courier New" w:hAnsi="Courier New" w:cs="Courier New"/>
-        </w:rPr>
-        <w:t>[INSERT FIGURE E-4: `evidence/ui/automation/20260406_053902_TC-UI-INV-001-failure.png`]</w:t>
-      </w:r>
-    </w:p>
-    <w:p>
-      <w:pPr>
-        <w:pStyle w:val="PlainText"/>
-        <w:rPr>
-          <w:rFonts w:ascii="Courier New" w:hAnsi="Courier New" w:cs="Courier New"/>
-        </w:rPr>
-      </w:pPr>
-      <w:r>
-        <w:rPr>
-          <w:rFonts w:ascii="Courier New" w:hAnsi="Courier New" w:cs="Courier New"/>
-        </w:rPr>
-        <w:t>[INSERT FIGURE E-5: `evidence/ui/automation/20260406_054245_TC-UI-AUTH-003-access-denied.png`]</w:t>
-      </w:r>
-    </w:p>
-    <w:p>
-      <w:pPr>
-        <w:pStyle w:val="PlainText"/>
-        <w:rPr>
-          <w:rFonts w:ascii="Courier New" w:hAnsi="Courier New" w:cs="Courier New"/>
-        </w:rPr>
-      </w:pPr>
-      <w:r>
-        <w:rPr>
-          <w:rFonts w:ascii="Courier New" w:hAnsi="Courier New" w:cs="Courier New"/>
-        </w:rPr>
-        <w:t>[INSERT FIGURE E-6: `evidence/ui/automation/20260406_054115_TC-UI-IMP-002-preview.png`]</w:t>
+        <w:t>Figure E-1. Admin login success evidence.</w:t>
+      </w:r>
+    </w:p>
+    <w:p>
+      <w:pPr>
+        <w:pStyle w:val="PlainText"/>
+        <w:rPr>
+          <w:rFonts w:ascii="Courier New" w:hAnsi="Courier New" w:cs="Courier New"/>
+        </w:rPr>
+      </w:pPr>
+    </w:p>
+    <w:p>
+      <w:pPr>
+        <w:pStyle w:val="PlainText"/>
+        <w:rPr>
+          <w:rFonts w:ascii="Courier New" w:hAnsi="Courier New" w:cs="Courier New"/>
+        </w:rPr>
+      </w:pPr>
+      <w:r>
+        <w:rPr>
+          <w:rFonts w:ascii="Courier New" w:hAnsi="Courier New" w:cs="Courier New"/>
+        </w:rPr>
+        <w:t>![Figure E-1 - Admin login success](../evidence/ui/automation/20260406_053930_TC-UI-AUTH-001-success.png)</w:t>
+      </w:r>
+    </w:p>
+    <w:p>
+      <w:pPr>
+        <w:pStyle w:val="PlainText"/>
+        <w:rPr>
+          <w:rFonts w:ascii="Courier New" w:hAnsi="Courier New" w:cs="Courier New"/>
+        </w:rPr>
+      </w:pPr>
+    </w:p>
+    <w:p>
+      <w:pPr>
+        <w:pStyle w:val="PlainText"/>
+        <w:rPr>
+          <w:rFonts w:ascii="Courier New" w:hAnsi="Courier New" w:cs="Courier New"/>
+        </w:rPr>
+      </w:pPr>
+      <w:r>
+        <w:rPr>
+          <w:rFonts w:ascii="Courier New" w:hAnsi="Courier New" w:cs="Courier New"/>
+        </w:rPr>
+        <w:t>Figure E-2. Newman full-run summary snippet.</w:t>
+      </w:r>
+    </w:p>
+    <w:p>
+      <w:pPr>
+        <w:pStyle w:val="PlainText"/>
+        <w:rPr>
+          <w:rFonts w:ascii="Courier New" w:hAnsi="Courier New" w:cs="Courier New"/>
+        </w:rPr>
+      </w:pPr>
+    </w:p>
+    <w:p>
+      <w:pPr>
+        <w:pStyle w:val="PlainText"/>
+        <w:rPr>
+          <w:rFonts w:ascii="Courier New" w:hAnsi="Courier New" w:cs="Courier New"/>
+        </w:rPr>
+      </w:pPr>
+      <w:r>
+        <w:rPr>
+          <w:rFonts w:ascii="Courier New" w:hAnsi="Courier New" w:cs="Courier New"/>
+        </w:rPr>
+        <w:t>![Figure E-2 - Newman full run summary](../evidence/report/OSMS-Newman-Full-Run-Snippet.png)</w:t>
+      </w:r>
+    </w:p>
+    <w:p>
+      <w:pPr>
+        <w:pStyle w:val="PlainText"/>
+        <w:rPr>
+          <w:rFonts w:ascii="Courier New" w:hAnsi="Courier New" w:cs="Courier New"/>
+        </w:rPr>
+      </w:pPr>
+    </w:p>
+    <w:p>
+      <w:pPr>
+        <w:pStyle w:val="PlainText"/>
+        <w:rPr>
+          <w:rFonts w:ascii="Courier New" w:hAnsi="Courier New" w:cs="Courier New"/>
+        </w:rPr>
+      </w:pPr>
+      <w:r>
+        <w:rPr>
+          <w:rFonts w:ascii="Courier New" w:hAnsi="Courier New" w:cs="Courier New"/>
+        </w:rPr>
+        <w:t>Figure E-3. Draft purchase creation success evidence.</w:t>
+      </w:r>
+    </w:p>
+    <w:p>
+      <w:pPr>
+        <w:pStyle w:val="PlainText"/>
+        <w:rPr>
+          <w:rFonts w:ascii="Courier New" w:hAnsi="Courier New" w:cs="Courier New"/>
+        </w:rPr>
+      </w:pPr>
+    </w:p>
+    <w:p>
+      <w:pPr>
+        <w:pStyle w:val="PlainText"/>
+        <w:rPr>
+          <w:rFonts w:ascii="Courier New" w:hAnsi="Courier New" w:cs="Courier New"/>
+        </w:rPr>
+      </w:pPr>
+      <w:r>
+        <w:rPr>
+          <w:rFonts w:ascii="Courier New" w:hAnsi="Courier New" w:cs="Courier New"/>
+        </w:rPr>
+        <w:t>![Figure E-3 - Draft purchase created](../evidence/ui/automation/20260406_054004_TC-UI-PUR-001-draft-created.png)</w:t>
+      </w:r>
+    </w:p>
+    <w:p>
+      <w:pPr>
+        <w:pStyle w:val="PlainText"/>
+        <w:rPr>
+          <w:rFonts w:ascii="Courier New" w:hAnsi="Courier New" w:cs="Courier New"/>
+        </w:rPr>
+      </w:pPr>
+    </w:p>
+    <w:p>
+      <w:pPr>
+        <w:pStyle w:val="PlainText"/>
+        <w:rPr>
+          <w:rFonts w:ascii="Courier New" w:hAnsi="Courier New" w:cs="Courier New"/>
+        </w:rPr>
+      </w:pPr>
+      <w:r>
+        <w:rPr>
+          <w:rFonts w:ascii="Courier New" w:hAnsi="Courier New" w:cs="Courier New"/>
+        </w:rPr>
+        <w:t>Figure E-4. Invoice creation failure evidence.</w:t>
+      </w:r>
+    </w:p>
+    <w:p>
+      <w:pPr>
+        <w:pStyle w:val="PlainText"/>
+        <w:rPr>
+          <w:rFonts w:ascii="Courier New" w:hAnsi="Courier New" w:cs="Courier New"/>
+        </w:rPr>
+      </w:pPr>
+    </w:p>
+    <w:p>
+      <w:pPr>
+        <w:pStyle w:val="PlainText"/>
+        <w:rPr>
+          <w:rFonts w:ascii="Courier New" w:hAnsi="Courier New" w:cs="Courier New"/>
+        </w:rPr>
+      </w:pPr>
+      <w:r>
+        <w:rPr>
+          <w:rFonts w:ascii="Courier New" w:hAnsi="Courier New" w:cs="Courier New"/>
+        </w:rPr>
+        <w:t>![Figure E-4 - Invoice creation failure](../evidence/ui/automation/20260406_053902_TC-UI-INV-001-failure.png)</w:t>
+      </w:r>
+    </w:p>
+    <w:p>
+      <w:pPr>
+        <w:pStyle w:val="PlainText"/>
+        <w:rPr>
+          <w:rFonts w:ascii="Courier New" w:hAnsi="Courier New" w:cs="Courier New"/>
+        </w:rPr>
+      </w:pPr>
+    </w:p>
+    <w:p>
+      <w:pPr>
+        <w:pStyle w:val="PlainText"/>
+        <w:rPr>
+          <w:rFonts w:ascii="Courier New" w:hAnsi="Courier New" w:cs="Courier New"/>
+        </w:rPr>
+      </w:pPr>
+      <w:r>
+        <w:rPr>
+          <w:rFonts w:ascii="Courier New" w:hAnsi="Courier New" w:cs="Courier New"/>
+        </w:rPr>
+        <w:t>Figure E-5. Permission-denial redirect evidence for sales user.</w:t>
+      </w:r>
+    </w:p>
+    <w:p>
+      <w:pPr>
+        <w:pStyle w:val="PlainText"/>
+        <w:rPr>
+          <w:rFonts w:ascii="Courier New" w:hAnsi="Courier New" w:cs="Courier New"/>
+        </w:rPr>
+      </w:pPr>
+    </w:p>
+    <w:p>
+      <w:pPr>
+        <w:pStyle w:val="PlainText"/>
+        <w:rPr>
+          <w:rFonts w:ascii="Courier New" w:hAnsi="Courier New" w:cs="Courier New"/>
+        </w:rPr>
+      </w:pPr>
+      <w:r>
+        <w:rPr>
+          <w:rFonts w:ascii="Courier New" w:hAnsi="Courier New" w:cs="Courier New"/>
+        </w:rPr>
+        <w:t>![Figure E-5 - Permission denial](../evidence/ui/automation/20260406_054245_TC-UI-AUTH-003-access-denied.png)</w:t>
+      </w:r>
+    </w:p>
+    <w:p>
+      <w:pPr>
+        <w:pStyle w:val="PlainText"/>
+        <w:rPr>
+          <w:rFonts w:ascii="Courier New" w:hAnsi="Courier New" w:cs="Courier New"/>
+        </w:rPr>
+      </w:pPr>
+    </w:p>
+    <w:p>
+      <w:pPr>
+        <w:pStyle w:val="PlainText"/>
+        <w:rPr>
+          <w:rFonts w:ascii="Courier New" w:hAnsi="Courier New" w:cs="Courier New"/>
+        </w:rPr>
+      </w:pPr>
+      <w:r>
+        <w:rPr>
+          <w:rFonts w:ascii="Courier New" w:hAnsi="Courier New" w:cs="Courier New"/>
+        </w:rPr>
+        <w:t>Figure E-6. Product import preview-count evidence.</w:t>
+      </w:r>
+    </w:p>
+    <w:p>
+      <w:pPr>
+        <w:pStyle w:val="PlainText"/>
+        <w:rPr>
+          <w:rFonts w:ascii="Courier New" w:hAnsi="Courier New" w:cs="Courier New"/>
+        </w:rPr>
+      </w:pPr>
+    </w:p>
+    <w:p>
+      <w:pPr>
+        <w:pStyle w:val="PlainText"/>
+        <w:rPr>
+          <w:rFonts w:ascii="Courier New" w:hAnsi="Courier New" w:cs="Courier New"/>
+        </w:rPr>
+      </w:pPr>
+      <w:r>
+        <w:rPr>
+          <w:rFonts w:ascii="Courier New" w:hAnsi="Courier New" w:cs="Courier New"/>
+        </w:rPr>
+        <w:t>![Figure E-6 - Product import preview](../evidence/ui/automation/20260406_054115_TC-UI-IMP-002-preview.png)</w:t>
       </w:r>
     </w:p>
     <w:p>
@@ -3858,6 +4024,34 @@
         <w:rPr>
           <w:rFonts w:ascii="Courier New" w:hAnsi="Courier New" w:cs="Courier New"/>
         </w:rPr>
+        <w:t xml:space="preserve">  - GitHub Issue: `#1`</w:t>
+      </w:r>
+    </w:p>
+    <w:p>
+      <w:pPr>
+        <w:pStyle w:val="PlainText"/>
+        <w:rPr>
+          <w:rFonts w:ascii="Courier New" w:hAnsi="Courier New" w:cs="Courier New"/>
+        </w:rPr>
+      </w:pPr>
+      <w:r>
+        <w:rPr>
+          <w:rFonts w:ascii="Courier New" w:hAnsi="Courier New" w:cs="Courier New"/>
+        </w:rPr>
+        <w:t xml:space="preserve">  - GitHub URL: `https://github.com/Alucard30Dec/Online-Sales-Management-System/issues/1`</w:t>
+      </w:r>
+    </w:p>
+    <w:p>
+      <w:pPr>
+        <w:pStyle w:val="PlainText"/>
+        <w:rPr>
+          <w:rFonts w:ascii="Courier New" w:hAnsi="Courier New" w:cs="Courier New"/>
+        </w:rPr>
+      </w:pPr>
+      <w:r>
+        <w:rPr>
+          <w:rFonts w:ascii="Courier New" w:hAnsi="Courier New" w:cs="Courier New"/>
+        </w:rPr>
         <w:t xml:space="preserve">  - evidence:</w:t>
       </w:r>
     </w:p>
@@ -3910,19 +4104,11 @@
           <w:rFonts w:ascii="Courier New" w:hAnsi="Courier New" w:cs="Courier New"/>
         </w:rPr>
       </w:pPr>
-    </w:p>
-    <w:p>
-      <w:pPr>
-        <w:pStyle w:val="PlainText"/>
-        <w:rPr>
-          <w:rFonts w:ascii="Courier New" w:hAnsi="Courier New" w:cs="Courier New"/>
-        </w:rPr>
-      </w:pPr>
-      <w:r>
-        <w:rPr>
-          <w:rFonts w:ascii="Courier New" w:hAnsi="Courier New" w:cs="Courier New"/>
-        </w:rPr>
-        <w:t>GitHub Issue creation for this defect remains `PENDING REAL EXECUTION` because GitHub CLI is not available in the current local environment.</w:t>
+      <w:r>
+        <w:rPr>
+          <w:rFonts w:ascii="Courier New" w:hAnsi="Courier New" w:cs="Courier New"/>
+        </w:rPr>
+        <w:t xml:space="preserve">    - GitHub Issue screenshot with labels</w:t>
       </w:r>
     </w:p>
     <w:p>
@@ -3954,11 +4140,41 @@
           <w:rFonts w:ascii="Courier New" w:hAnsi="Courier New" w:cs="Courier New"/>
         </w:rPr>
       </w:pPr>
-      <w:r>
-        <w:rPr>
-          <w:rFonts w:ascii="Courier New" w:hAnsi="Courier New" w:cs="Courier New"/>
-        </w:rPr>
-        <w:t>[INSERT FIGURE B-1: `PENDING REAL EXECUTION` GitHub Issue screenshot if a confirmed defect is opened]</w:t>
+    </w:p>
+    <w:p>
+      <w:pPr>
+        <w:pStyle w:val="PlainText"/>
+        <w:rPr>
+          <w:rFonts w:ascii="Courier New" w:hAnsi="Courier New" w:cs="Courier New"/>
+        </w:rPr>
+      </w:pPr>
+      <w:r>
+        <w:rPr>
+          <w:rFonts w:ascii="Courier New" w:hAnsi="Courier New" w:cs="Courier New"/>
+        </w:rPr>
+        <w:t>Figure B-1. GitHub Issue evidence for the confirmed invoice defect.</w:t>
+      </w:r>
+    </w:p>
+    <w:p>
+      <w:pPr>
+        <w:pStyle w:val="PlainText"/>
+        <w:rPr>
+          <w:rFonts w:ascii="Courier New" w:hAnsi="Courier New" w:cs="Courier New"/>
+        </w:rPr>
+      </w:pPr>
+    </w:p>
+    <w:p>
+      <w:pPr>
+        <w:pStyle w:val="PlainText"/>
+        <w:rPr>
+          <w:rFonts w:ascii="Courier New" w:hAnsi="Courier New" w:cs="Courier New"/>
+        </w:rPr>
+      </w:pPr>
+      <w:r>
+        <w:rPr>
+          <w:rFonts w:ascii="Courier New" w:hAnsi="Courier New" w:cs="Courier New"/>
+        </w:rPr>
+        <w:t>![Figure B-1 - GitHub issue screenshot](../evidence/defects/BUG-20260406-001-github-issue.png)</w:t>
       </w:r>
     </w:p>
     <w:p>
@@ -4696,11 +4912,41 @@
           <w:rFonts w:ascii="Courier New" w:hAnsi="Courier New" w:cs="Courier New"/>
         </w:rPr>
       </w:pPr>
-      <w:r>
-        <w:rPr>
-          <w:rFonts w:ascii="Courier New" w:hAnsi="Courier New" w:cs="Courier New"/>
-        </w:rPr>
-        <w:t>[INSERT FIGURE M-1: `PENDING REAL EXECUTION` screenshot of `metrics/OSMS-Test-Metrics.xlsx` summary sheet]</w:t>
+    </w:p>
+    <w:p>
+      <w:pPr>
+        <w:pStyle w:val="PlainText"/>
+        <w:rPr>
+          <w:rFonts w:ascii="Courier New" w:hAnsi="Courier New" w:cs="Courier New"/>
+        </w:rPr>
+      </w:pPr>
+      <w:r>
+        <w:rPr>
+          <w:rFonts w:ascii="Courier New" w:hAnsi="Courier New" w:cs="Courier New"/>
+        </w:rPr>
+        <w:t>Figure M-1. Metrics summary exported from the workbook.</w:t>
+      </w:r>
+    </w:p>
+    <w:p>
+      <w:pPr>
+        <w:pStyle w:val="PlainText"/>
+        <w:rPr>
+          <w:rFonts w:ascii="Courier New" w:hAnsi="Courier New" w:cs="Courier New"/>
+        </w:rPr>
+      </w:pPr>
+    </w:p>
+    <w:p>
+      <w:pPr>
+        <w:pStyle w:val="PlainText"/>
+        <w:rPr>
+          <w:rFonts w:ascii="Courier New" w:hAnsi="Courier New" w:cs="Courier New"/>
+        </w:rPr>
+      </w:pPr>
+      <w:r>
+        <w:rPr>
+          <w:rFonts w:ascii="Courier New" w:hAnsi="Courier New" w:cs="Courier New"/>
+        </w:rPr>
+        <w:t>![Figure M-1 - Metrics summary](../evidence/report/OSMS-Test-Metrics-Summary.png)</w:t>
       </w:r>
     </w:p>
     <w:p>
@@ -4924,29 +5170,29 @@
         <w:rPr>
           <w:rFonts w:ascii="Courier New" w:hAnsi="Courier New" w:cs="Courier New"/>
         </w:rPr>
-        <w:t>The report also still lacks some high-value evidence:</w:t>
-      </w:r>
-    </w:p>
-    <w:p>
-      <w:pPr>
-        <w:pStyle w:val="PlainText"/>
-        <w:rPr>
-          <w:rFonts w:ascii="Courier New" w:hAnsi="Courier New" w:cs="Courier New"/>
-        </w:rPr>
-      </w:pPr>
-    </w:p>
-    <w:p>
-      <w:pPr>
-        <w:pStyle w:val="PlainText"/>
-        <w:rPr>
-          <w:rFonts w:ascii="Courier New" w:hAnsi="Courier New" w:cs="Courier New"/>
-        </w:rPr>
-      </w:pPr>
-      <w:r>
-        <w:rPr>
-          <w:rFonts w:ascii="Courier New" w:hAnsi="Courier New" w:cs="Courier New"/>
-        </w:rPr>
-        <w:t>- GitHub Issue screenshot for `BUG-20260406-001`</w:t>
+        <w:t>The report still lacks some high-value execution depth:</w:t>
+      </w:r>
+    </w:p>
+    <w:p>
+      <w:pPr>
+        <w:pStyle w:val="PlainText"/>
+        <w:rPr>
+          <w:rFonts w:ascii="Courier New" w:hAnsi="Courier New" w:cs="Courier New"/>
+        </w:rPr>
+      </w:pPr>
+    </w:p>
+    <w:p>
+      <w:pPr>
+        <w:pStyle w:val="PlainText"/>
+        <w:rPr>
+          <w:rFonts w:ascii="Courier New" w:hAnsi="Courier New" w:cs="Courier New"/>
+        </w:rPr>
+      </w:pPr>
+      <w:r>
+        <w:rPr>
+          <w:rFonts w:ascii="Courier New" w:hAnsi="Courier New" w:cs="Courier New"/>
+        </w:rPr>
+        <w:t>- additional business-flow evidence for `Stock`, `Reports`, `Products`, and `Public Catalog`</w:t>
       </w:r>
     </w:p>
     <w:p>
@@ -5012,63 +5258,49 @@
         <w:rPr>
           <w:rFonts w:ascii="Courier New" w:hAnsi="Courier New" w:cs="Courier New"/>
         </w:rPr>
-        <w:t>1. create the external GitHub Issue for `BUG-20260406-001` and capture the issue screenshot</w:t>
-      </w:r>
-    </w:p>
-    <w:p>
-      <w:pPr>
-        <w:pStyle w:val="PlainText"/>
-        <w:rPr>
-          <w:rFonts w:ascii="Courier New" w:hAnsi="Courier New" w:cs="Courier New"/>
-        </w:rPr>
-      </w:pPr>
-      <w:r>
-        <w:rPr>
-          <w:rFonts w:ascii="Courier New" w:hAnsi="Courier New" w:cs="Courier New"/>
-        </w:rPr>
-        <w:t>2. fix and retest invoice creation, then capture the post-fix details-page evidence</w:t>
-      </w:r>
-    </w:p>
-    <w:p>
-      <w:pPr>
-        <w:pStyle w:val="PlainText"/>
-        <w:rPr>
-          <w:rFonts w:ascii="Courier New" w:hAnsi="Courier New" w:cs="Courier New"/>
-        </w:rPr>
-      </w:pPr>
-      <w:r>
-        <w:rPr>
-          <w:rFonts w:ascii="Courier New" w:hAnsi="Courier New" w:cs="Courier New"/>
-        </w:rPr>
-        <w:t>3. execute the remaining high-value UI areas: `Stock`, `Reports`, `Products`, and `Public Catalog`</w:t>
-      </w:r>
-    </w:p>
-    <w:p>
-      <w:pPr>
-        <w:pStyle w:val="PlainText"/>
-        <w:rPr>
-          <w:rFonts w:ascii="Courier New" w:hAnsi="Courier New" w:cs="Courier New"/>
-        </w:rPr>
-      </w:pPr>
-      <w:r>
-        <w:rPr>
-          <w:rFonts w:ascii="Courier New" w:hAnsi="Courier New" w:cs="Courier New"/>
-        </w:rPr>
-        <w:t>4. commit the generated PDF and PPTX artifacts together with the refreshed evidence pack</w:t>
-      </w:r>
-    </w:p>
-    <w:p>
-      <w:pPr>
-        <w:pStyle w:val="PlainText"/>
-        <w:rPr>
-          <w:rFonts w:ascii="Courier New" w:hAnsi="Courier New" w:cs="Courier New"/>
-        </w:rPr>
-      </w:pPr>
-      <w:r>
-        <w:rPr>
-          <w:rFonts w:ascii="Courier New" w:hAnsi="Courier New" w:cs="Courier New"/>
-        </w:rPr>
-        <w:t>5. commit the generated automation demo video together with the refreshed evidence pack</w:t>
+        <w:t>1. fix and retest invoice creation, then add post-fix evidence to GitHub Issue `#1`</w:t>
+      </w:r>
+    </w:p>
+    <w:p>
+      <w:pPr>
+        <w:pStyle w:val="PlainText"/>
+        <w:rPr>
+          <w:rFonts w:ascii="Courier New" w:hAnsi="Courier New" w:cs="Courier New"/>
+        </w:rPr>
+      </w:pPr>
+      <w:r>
+        <w:rPr>
+          <w:rFonts w:ascii="Courier New" w:hAnsi="Courier New" w:cs="Courier New"/>
+        </w:rPr>
+        <w:t>2. execute the remaining high-value UI areas: `Stock`, `Reports`, `Products`, and `Public Catalog`</w:t>
+      </w:r>
+    </w:p>
+    <w:p>
+      <w:pPr>
+        <w:pStyle w:val="PlainText"/>
+        <w:rPr>
+          <w:rFonts w:ascii="Courier New" w:hAnsi="Courier New" w:cs="Courier New"/>
+        </w:rPr>
+      </w:pPr>
+      <w:r>
+        <w:rPr>
+          <w:rFonts w:ascii="Courier New" w:hAnsi="Courier New" w:cs="Courier New"/>
+        </w:rPr>
+        <w:t>3. optionally add cross-browser evidence if Edge is available</w:t>
+      </w:r>
+    </w:p>
+    <w:p>
+      <w:pPr>
+        <w:pStyle w:val="PlainText"/>
+        <w:rPr>
+          <w:rFonts w:ascii="Courier New" w:hAnsi="Courier New" w:cs="Courier New"/>
+        </w:rPr>
+      </w:pPr>
+      <w:r>
+        <w:rPr>
+          <w:rFonts w:ascii="Courier New" w:hAnsi="Courier New" w:cs="Courier New"/>
+        </w:rPr>
+        <w:t>4. keep the final PDF, PPTX, issue screenshot, and automation video aligned with any future retest update</w:t>
       </w:r>
     </w:p>
     <w:p>
@@ -5570,20 +5802,6 @@
           <w:rFonts w:ascii="Courier New" w:hAnsi="Courier New" w:cs="Courier New"/>
         </w:rPr>
       </w:pPr>
-    </w:p>
-    <w:p>
-      <w:pPr>
-        <w:pStyle w:val="PlainText"/>
-        <w:rPr>
-          <w:rFonts w:ascii="Courier New" w:hAnsi="Courier New" w:cs="Courier New"/>
-        </w:rPr>
-      </w:pPr>
-      <w:r>
-        <w:rPr>
-          <w:rFonts w:ascii="Courier New" w:hAnsi="Courier New" w:cs="Courier New"/>
-        </w:rPr>
-        <w:t>- `PENDING REAL EXECUTION`: GitHub Issue screenshot if a confirmed defect is opened</w:t>
-      </w:r>
     </w:p>
     <w:p>
       <w:pPr>
@@ -6125,7 +6343,7 @@
     <w:link w:val="PlainTextChar"/>
     <w:uiPriority w:val="99"/>
     <w:unhideWhenUsed/>
-    <w:rsid w:val="008853C9"/>
+    <w:rsid w:val="002139CA"/>
     <w:pPr>
       <w:spacing w:after="0" w:line="240" w:lineRule="auto"/>
     </w:pPr>
@@ -6140,7 +6358,7 @@
     <w:basedOn w:val="DefaultParagraphFont"/>
     <w:link w:val="PlainText"/>
     <w:uiPriority w:val="99"/>
-    <w:rsid w:val="008853C9"/>
+    <w:rsid w:val="002139CA"/>
     <w:rPr>
       <w:rFonts w:ascii="Consolas" w:hAnsi="Consolas"/>
       <w:sz w:val="21"/>

</xml_diff>